<commit_message>
Re-scope compliance to Phase 1 launch (Class Builder + Schedule Builder only)
Strategic decision: go to market with the two browser-only products only; defer
CICO + Referral Tracking (and their student-data compliance burden) to Phase 2
until product-market fit is confirmed. Both launch products store NO student data
server-side, which collapses most FERPA/state-law/breach obligations to Phase 2.

- 16 Go-To-Market Scope memo (new): the decision, why it slashes the launch burden,
  the Phase 1 short list, and a Phase 1/2 map of every existing doc.
- Tracker: added a Phase column to every tab (46 Phase 1 / 10 Phase 2), a Phase-1
  launch-focus block on the Dashboard, and a scope note on Start Here.
- Scope banners on 08 (privacy) and 15 (trust page) so they aren't misleading in
  isolation; offered a lean Phase-1 privacy/trust rewrite.

Docs are drafts for review; not legal advice; outside public/ (never web-served).

Co-Authored-By: Claude Opus 4.8 (1M context) <noreply@anthropic.com>
</commit_message>
<xml_diff>
--- a/compliance/08_Privacy_Policy_DRAFT.docx
+++ b/compliance/08_Privacy_Policy_DRAFT.docx
@@ -132,6 +132,128 @@
       <w:r>
         <w:rPr>
           <w:rFonts w:ascii="Arial" w:hAnsi="Arial"/>
+          <w:b/>
+          <w:color w:val="555F6A"/>
+          <w:sz w:val="20"/>
+        </w:rPr>
+        <w:t>⚠️ SCOPE UPDATE (2026-07-21) — read before publishing.</w:t>
+      </w:r>
+      <w:r>
+        <w:rPr>
+          <w:rFonts w:ascii="Arial" w:hAnsi="Arial"/>
+          <w:color w:val="555F6A"/>
+          <w:sz w:val="20"/>
+        </w:rPr>
+        <w:t xml:space="preserve"> Go-to-market is </w:t>
+      </w:r>
+      <w:r>
+        <w:rPr>
+          <w:rFonts w:ascii="Arial" w:hAnsi="Arial"/>
+          <w:b/>
+          <w:color w:val="555F6A"/>
+          <w:sz w:val="20"/>
+        </w:rPr>
+        <w:t>Class Builder + Schedule Builder only</w:t>
+      </w:r>
+      <w:r>
+        <w:rPr>
+          <w:rFonts w:ascii="Arial" w:hAnsi="Arial"/>
+          <w:color w:val="555F6A"/>
+          <w:sz w:val="20"/>
+        </w:rPr>
+        <w:t xml:space="preserve"> (see </w:t>
+      </w:r>
+      <w:r>
+        <w:rPr>
+          <w:rFonts w:ascii="Consolas" w:hAnsi="Consolas"/>
+          <w:color w:val="555F6A"/>
+          <w:sz w:val="18"/>
+        </w:rPr>
+        <w:t>16_Go_To_Market_Scope.md</w:t>
+      </w:r>
+      <w:r>
+        <w:rPr>
+          <w:rFonts w:ascii="Arial" w:hAnsi="Arial"/>
+          <w:color w:val="555F6A"/>
+          <w:sz w:val="20"/>
+        </w:rPr>
+        <w:t xml:space="preserve">). </w:t>
+      </w:r>
+      <w:r>
+        <w:rPr>
+          <w:rFonts w:ascii="Arial" w:hAnsi="Arial"/>
+          <w:b/>
+          <w:color w:val="555F6A"/>
+          <w:sz w:val="20"/>
+        </w:rPr>
+        <w:t>Neither stores student data on our servers.</w:t>
+      </w:r>
+      <w:r>
+        <w:rPr>
+          <w:rFonts w:ascii="Arial" w:hAnsi="Arial"/>
+          <w:color w:val="555F6A"/>
+          <w:sz w:val="20"/>
+        </w:rPr>
+        <w:t xml:space="preserve"> For launch, the strongest, simplest policy leads with *"we do not store student data"* and covers only staff accounts + anonymous analytics. The </w:t>
+      </w:r>
+      <w:r>
+        <w:rPr>
+          <w:rFonts w:ascii="Arial" w:hAnsi="Arial"/>
+          <w:b/>
+          <w:color w:val="555F6A"/>
+          <w:sz w:val="20"/>
+        </w:rPr>
+        <w:t>CICO/Referral Tracking sections below (§2, §5 rows) apply only when those products launch (Phase 2)</w:t>
+      </w:r>
+      <w:r>
+        <w:rPr>
+          <w:rFonts w:ascii="Arial" w:hAnsi="Arial"/>
+          <w:color w:val="555F6A"/>
+          <w:sz w:val="20"/>
+        </w:rPr>
+        <w:t xml:space="preserve"> — keep them out of the launch version or clearly mark them "not yet offered." I can produce a </w:t>
+      </w:r>
+      <w:r>
+        <w:rPr>
+          <w:rFonts w:ascii="Arial" w:hAnsi="Arial"/>
+          <w:b/>
+          <w:color w:val="555F6A"/>
+          <w:sz w:val="20"/>
+        </w:rPr>
+        <w:t>lean Phase-1 privacy policy</w:t>
+      </w:r>
+      <w:r>
+        <w:rPr>
+          <w:rFonts w:ascii="Arial" w:hAnsi="Arial"/>
+          <w:color w:val="555F6A"/>
+          <w:sz w:val="20"/>
+        </w:rPr>
+        <w:t xml:space="preserve"> on request; the fuller text below is retained as the Phase-2 baseline.</w:t>
+      </w:r>
+    </w:p>
+    <w:p>
+      <w:pPr>
+        <w:spacing w:after="120"/>
+      </w:pPr>
+      <w:r>
+        <w:rPr>
+          <w:rFonts w:ascii="Arial" w:hAnsi="Arial"/>
+          <w:sz w:val="21"/>
+        </w:rPr>
+        <w:t>&gt;</w:t>
+      </w:r>
+    </w:p>
+    <w:p>
+      <w:pPr>
+        <w:spacing w:before="80" w:after="120"/>
+        <w:ind w:left="288"/>
+        <w:pBdr>
+          <w:left w:val="single" w:sz="18" w:space="8" w:color="2A9D8F"/>
+        </w:pBdr>
+      </w:pPr>
+      <w:r>
+        <w:rPr>
+          <w:rFonts w:ascii="Arial" w:hAnsi="Arial"/>
           <w:color w:val="555F6A"/>
           <w:sz w:val="20"/>
         </w:rPr>
@@ -168,7 +290,7 @@
           <w:color w:val="555F6A"/>
           <w:sz w:val="20"/>
         </w:rPr>
-        <w:t xml:space="preserve"> posture (selling to districts with real student data), and fixes three factual gaps in the live page: (1) it lists </w:t>
+        <w:t xml:space="preserve"> posture, and fixes three factual gaps in the live page: (1) it lists </w:t>
       </w:r>
       <w:r>
         <w:rPr>

</xml_diff>